<commit_message>
Personalize project report and presentation
</commit_message>
<xml_diff>
--- a/Documentation/Hotel_Haven_Project_Report.docx
+++ b/Documentation/Hotel_Haven_Project_Report.docx
@@ -63,7 +63,7 @@
         <w:rPr>
           <w:sz w:val="20"/>
         </w:rPr>
-        <w:t>Submitted by: [Your Name]</w:t>
+        <w:t>Submitted by: Swayam Krupesh Nakhwa</w:t>
       </w:r>
     </w:p>
     <w:p>
@@ -75,7 +75,7 @@
         <w:rPr>
           <w:sz w:val="20"/>
         </w:rPr>
-        <w:t>Enrollment / Roll No.: [Your Roll Number]</w:t>
+        <w:t>Roll No.: BT24ECE080</w:t>
       </w:r>
     </w:p>
     <w:p>
@@ -87,7 +87,9 @@
         <w:rPr>
           <w:sz w:val="20"/>
         </w:rPr>
-        <w:t>Course / Semester: [Course and Semester]</w:t>
+        <w:t>Course: Introduction to Object Oriented Programming</w:t>
+        <w:br/>
+        <w:t>Semester: 5th Semester</w:t>
       </w:r>
     </w:p>
     <w:p>
@@ -99,7 +101,7 @@
         <w:rPr>
           <w:sz w:val="20"/>
         </w:rPr>
-        <w:t>Guided by: [Faculty Name]</w:t>
+        <w:t>Guided by: Aparna Wamanrao Bondade Ma'am</w:t>
       </w:r>
     </w:p>
     <w:p>
@@ -111,7 +113,7 @@
         <w:rPr>
           <w:sz w:val="20"/>
         </w:rPr>
-        <w:t>[College / Institution Name]</w:t>
+        <w:t>Indian Institute of Information Technology Nagpur</w:t>
       </w:r>
     </w:p>
     <w:p>

</xml_diff>